<commit_message>
Add water-molecule watermark to chemical-bonds lesson plan template
Co-Authored-By: Claude Opus 5.5 <noreply@anthropic.com>
Claude-Session: https://claude.ai/code/session_01NK2QyVezSBtq1pJYa1j4XV
</commit_message>
<xml_diff>
--- a/lesson-plans/قالب_تحضير_الروابط_الكيميائية.docx
+++ b/lesson-plans/قالب_تحضير_الروابط_الكيميائية.docx
@@ -5119,6 +5119,96 @@
             </a:graphicData>
           </a:graphic>
         </wp:inline>
+      </w:drawing>
+    </w:r>
+    <w:r>
+      <w:drawing>
+        <wp:anchor distT="0" distB="0" distL="0" distR="0" simplePos="0" relativeHeight="0" behindDoc="1" locked="1" layoutInCell="1" allowOverlap="1">
+          <wp:simplePos x="0" y="0"/>
+          <wp:positionH relativeFrom="page">
+            <wp:align>center</wp:align>
+          </wp:positionH>
+          <wp:positionV relativeFrom="page">
+            <wp:align>center</wp:align>
+          </wp:positionV>
+          <wp:extent cx="5760000" cy="4800000"/>
+          <wp:effectExtent l="0" t="0" r="0" b="0"/>
+          <wp:wrapNone/>
+          <wp:docPr id="9002" name="Watermark"/>
+          <wp:cNvGraphicFramePr>
+            <a:graphicFrameLocks noChangeAspect="1"/>
+          </wp:cNvGraphicFramePr>
+          <a:graphic>
+            <a:graphicData uri="http://schemas.openxmlformats.org/drawingml/2006/picture">
+              <pic:pic>
+                <pic:nvPicPr>
+                  <pic:cNvPr id="9002" name="Watermark.png"/>
+                  <pic:cNvPicPr/>
+                </pic:nvPicPr>
+                <pic:blipFill>
+                  <a:blip r:embed="rIdWm"/>
+                  <a:stretch>
+                    <a:fillRect/>
+                  </a:stretch>
+                </pic:blipFill>
+                <pic:spPr>
+                  <a:xfrm>
+                    <a:off x="0" y="0"/>
+                    <a:ext cx="5760000" cy="4800000"/>
+                  </a:xfrm>
+                  <a:prstGeom prst="rect">
+                    <a:avLst/>
+                  </a:prstGeom>
+                </pic:spPr>
+              </pic:pic>
+            </a:graphicData>
+          </a:graphic>
+        </wp:anchor>
+      </w:drawing>
+    </w:r>
+    <w:r>
+      <w:drawing>
+        <wp:anchor distT="0" distB="0" distL="0" distR="0" simplePos="0" relativeHeight="0" behindDoc="1" locked="1" layoutInCell="1" allowOverlap="1">
+          <wp:simplePos x="0" y="0"/>
+          <wp:positionH relativeFrom="page">
+            <wp:posOffset>480000</wp:posOffset>
+          </wp:positionH>
+          <wp:positionV relativeFrom="page">
+            <wp:posOffset>8350000</wp:posOffset>
+          </wp:positionV>
+          <wp:extent cx="1500000" cy="1850000"/>
+          <wp:effectExtent l="0" t="0" r="0" b="0"/>
+          <wp:wrapNone/>
+          <wp:docPr id="9003" name="CornerLattice"/>
+          <wp:cNvGraphicFramePr>
+            <a:graphicFrameLocks noChangeAspect="1"/>
+          </wp:cNvGraphicFramePr>
+          <a:graphic>
+            <a:graphicData uri="http://schemas.openxmlformats.org/drawingml/2006/picture">
+              <pic:pic>
+                <pic:nvPicPr>
+                  <pic:cNvPr id="9003" name="CornerLattice.png"/>
+                  <pic:cNvPicPr/>
+                </pic:nvPicPr>
+                <pic:blipFill>
+                  <a:blip r:embed="rIdWc"/>
+                  <a:stretch>
+                    <a:fillRect/>
+                  </a:stretch>
+                </pic:blipFill>
+                <pic:spPr>
+                  <a:xfrm>
+                    <a:off x="0" y="0"/>
+                    <a:ext cx="1500000" cy="1850000"/>
+                  </a:xfrm>
+                  <a:prstGeom prst="rect">
+                    <a:avLst/>
+                  </a:prstGeom>
+                </pic:spPr>
+              </pic:pic>
+            </a:graphicData>
+          </a:graphic>
+        </wp:anchor>
       </w:drawing>
     </w:r>
   </w:p>

</xml_diff>